<commit_message>
docs(report): honest positioning — title notes Focus #1 audit loop; '3 named + weather' replaces 'four required' overstatement
</commit_message>
<xml_diff>
--- a/report/Technical_Business_Report.docx
+++ b/report/Technical_Business_Report.docx
@@ -44,6 +44,20 @@
           <w:szCs w:val="20"/>
         </w:rPr>
         <w:t xml:space="preserve">UCLA MSBA AI Agents Project Challenge 2026  —  Core Focus #2: “What-if” Scenario Simulation</w:t>
+      </w:r>
+    </w:p>
+    <w:p>
+      <w:pPr>
+        <w:spacing w:after="320"/>
+        <w:jc w:val="center"/>
+      </w:pPr>
+      <w:r>
+        <w:rPr>
+          <w:color w:val="5A6B7A"/>
+          <w:sz w:val="18"/>
+          <w:szCs w:val="18"/>
+        </w:rPr>
+        <w:t xml:space="preserve">(with a complementary self-correcting compliance audit loop drawn from Focus #1)</w:t>
       </w:r>
     </w:p>
     <w:p>
@@ -430,7 +444,7 @@
         <w:t xml:space="preserve">The headline insight. </w:t>
       </w:r>
       <w:r>
-        <w:t xml:space="preserve">Across the four required disruption families, </w:t>
+        <w:t xml:space="preserve">Across the four disruption levers we modelled — the three named in the assignment (demand spike, warehouse / corridor closure, driver / truck shortage) plus a weather-surge lever that plugs into the playbook’s existing travel-buffer logic — </w:t>
       </w:r>
       <w:r>
         <w:rPr>
@@ -2054,7 +2068,7 @@
         <w:spacing w:after="120" w:line="300"/>
       </w:pPr>
       <w:r>
-        <w:t xml:space="preserve">Run against the augmented 48-hour feed (baseline penalty = 0), the four disruption families each isolate a different operational truth:</w:t>
+        <w:t xml:space="preserve">Run against the augmented 48-hour feed (baseline penalty = 0), the four disruption levers each isolate a different operational truth (the first three are the scenarios the assignment names; the fourth — weather surge — is the bonus lever we added):</w:t>
       </w:r>
     </w:p>
     <w:p>

</xml_diff>